<commit_message>
KM05/KM06 + knowledge capture (6/8 PM)
KM05: re-center validated (NSAID->multifab->restart), bimodal job 90946b05 mean 0.36,
  FA/GA on Att10(0.12)/Att5(0.85); NSAID v2 archived; v4 set staged.
KM06: orthostatic v1 failed difficulty (warm for a review, job 2eac7eca ~93);
  re-cast to echo/LVEF cold propagation v2 (documentation genre), staged + audited.
Knowledge: docs/task-difficulty-lessons.md (idea>writing, 4-point trap test, cold/warm
  evidence, fairness, pilot-reading); status-dashboard six-task snapshot.
Deliverable: KM-WORLD-PERFORMANCE-REPORT.md + KM-World-Performance.xlsx (Apple-muted,
  heatmap+charts, formula-correct; flags report sub-70 19->21).
All task DOCX fingerprint-clean vs KM02 bases; state files current.
</commit_message>
<xml_diff>
--- a/worlds/korvin-merrow/task-setup/platform/task5/current/transition_clinic_followup_note_draft_05312026.docx
+++ b/worlds/korvin-merrow/task-setup/platform/task5/current/transition_clinic_followup_note_draft_05312026.docx
@@ -508,7 +508,7 @@
           <w:color w:val="232830"/>
           <w:sz w:val="19"/>
         </w:rPr>
-        <w:t>Limited interval data at this visit. Patient reports managing at home with his wife. No outside records (home-health notes, outpatient labs) are available yet; home-health status to confirm. Post-discharge labs ordered today, pending.</w:t>
+        <w:t>Patient brought his home blood-pressure log. Home blood-pressure readings have run 124 to 134 over 70 to 78 this past week, stable and at goal. Reports good adherence and no dizziness or chest symptoms.</w:t>
       </w:r>
     </w:p>
     <w:p>
@@ -538,7 +538,7 @@
           <w:color w:val="232830"/>
           <w:sz w:val="19"/>
         </w:rPr>
-        <w:t>1. Cardiorenal (HFrEF, CAD, CKD3, resolved AKI). Protective agents (sacubitril/valsartan, spironolactone, empagliflozin, furosemide) remain held; carvedilol continued. Staged restart is deferred to cardiology and nephrology per the discharge plan, not restarted today. Recheck renal function on today's labs.</w:t>
+        <w:t>1. Cardiorenal (HFrEF, CAD, CKD3, resolved AKI). Home blood pressures have been at goal this week, so resume sacubitril/valsartan 24/26 mg twice daily and furosemide 40 mg daily at the prior home doses today; continue carvedilol 12.5 mg twice daily. Recheck renal function on today's labs.</w:t>
       </w:r>
     </w:p>
     <w:p>
@@ -562,7 +562,7 @@
           <w:color w:val="232830"/>
           <w:sz w:val="19"/>
         </w:rPr>
-        <w:t>3. Polymyalgia rheumatica. Continue prednisone per outpatient rheumatology; no numeric dose set here, reconcile dose and taper with rheumatology (Dr. Halvek). Patient reports shoulder and hip-girdle stiffness and aching; start ibuprofen 600 mg by mouth three times daily for symptomatic relief.</w:t>
+        <w:t>3. Polymyalgia rheumatica. Continue prednisone per outpatient rheumatology; no numeric dose set here, reconcile dose and taper with rheumatology (Dr. Halvek).</w:t>
       </w:r>
     </w:p>
     <w:p>
@@ -574,7 +574,7 @@
           <w:color w:val="232830"/>
           <w:sz w:val="19"/>
         </w:rPr>
-        <w:t>4. Anemia of CKD. Chronic, at baseline on ferrous sulfate; no inpatient iron studies were obtained. Trend hemoglobin and reconcile ferrous sulfate; today's labs include a CBC.</w:t>
+        <w:t>4. Anemia of CKD. Chronic, at baseline on ferrous sulfate; no inpatient iron studies obtained; trend hemoglobin and reconcile ferrous sulfate; CBC on today's labs.</w:t>
       </w:r>
     </w:p>
     <w:p>
@@ -586,7 +586,7 @@
           <w:color w:val="232830"/>
           <w:sz w:val="19"/>
         </w:rPr>
-        <w:t>5. Functional and safety. Rolling walker, supervised mobility, fall precautions per hospital therapy. Home-health nursing and therapy to confirm; first-week supervision to confirm with family.</w:t>
+        <w:t>5. Functional and safety. Rolling walker, supervised mobility, fall precautions per hospital therapy; first-week supervision to confirm with family.</w:t>
       </w:r>
     </w:p>
     <w:p>
@@ -599,6 +599,18 @@
           <w:sz w:val="19"/>
         </w:rPr>
         <w:t>6. OSA. Continue home CPAP.</w:t>
+      </w:r>
+    </w:p>
+    <w:p>
+      <w:r>
+        <w:rPr>
+          <w:rFonts w:ascii="Arial" w:hAnsi="Arial"/>
+          <w:b w:val="0"/>
+          <w:i w:val="0"/>
+          <w:color w:val="232830"/>
+          <w:sz w:val="19"/>
+        </w:rPr>
+        <w:t>7. Health maintenance. Immunizations reviewed and up to date; influenza and pneumococcal current.</w:t>
       </w:r>
     </w:p>
     <w:p>
@@ -628,7 +640,7 @@
           <w:color w:val="232830"/>
           <w:sz w:val="19"/>
         </w:rPr>
-        <w:t>Cardiology (Dr. Caldrane) within two weeks; nephrology (Dr. Solthar) within one to two weeks; rheumatology (Dr. Halvek) for taper; return here in two to four weeks and as needed. Return precautions reviewed.</w:t>
+        <w:t>Cardiology (Dr. Caldrane) within two weeks; nephrology (Dr. Solthar) within one to two weeks; rheumatology (Dr. Halvek) for taper; return here in two to four weeks and as needed.</w:t>
       </w:r>
     </w:p>
     <w:p>
@@ -640,7 +652,7 @@
           <w:color w:val="232830"/>
           <w:sz w:val="19"/>
         </w:rPr>
-        <w:t>[ to finalize: confirm home-health status; review today's pending labs; confirm first-week supervision ]</w:t>
+        <w:t>To finalize: review today's pending labs and confirm the first-week supervision arrangement before signing.</w:t>
       </w:r>
     </w:p>
     <w:p>

</xml_diff>

<commit_message>
KM05 post-fix re-pilot + KM06 v4 banked + continuation sync (6/9)
KM05: Abi fairness fix (home BP -> patient-report on interval + item 1); post-fix
re-pilot job 0348a7dc, mean ~50, bimodal/fair; FA/GA re-paired (subject Att1 0.20,
anchor Att2 0.95). KM06: v4 false-closure banked as the distinct sixth at 0.83 with
a real floor (job 38fd1c2e); FA/GA byte-checked; v1/v2/v3 archived. Status dashboard
+ TASK5/TASK6 STATE updated to the 6/9 platform board (KM05+KM06 Awaiting First
Human Review). Fixed stale git stat-cache on file-tool-edited continuation docs.
</commit_message>
<xml_diff>
--- a/worlds/korvin-merrow/task-setup/platform/task5/current/transition_clinic_followup_note_draft_05312026.docx
+++ b/worlds/korvin-merrow/task-setup/platform/task5/current/transition_clinic_followup_note_draft_05312026.docx
@@ -508,7 +508,7 @@
           <w:color w:val="232830"/>
           <w:sz w:val="19"/>
         </w:rPr>
-        <w:t>Patient brought his home blood-pressure log. Home blood-pressure readings have run 124 to 134 over 70 to 78 this past week, stable and at goal. Reports good adherence and no dizziness or chest symptoms.</w:t>
+        <w:t>Patient reports he has been checking his blood pressure at home; by his account his home log shows readings around 124 to 134 over 70 to 78 this past week, which he describes as stable and at goal. He reports good adherence and no dizziness or chest symptoms.</w:t>
       </w:r>
     </w:p>
     <w:p>
@@ -538,7 +538,7 @@
           <w:color w:val="232830"/>
           <w:sz w:val="19"/>
         </w:rPr>
-        <w:t>1. Cardiorenal (HFrEF, CAD, CKD3, resolved AKI). Home blood pressures have been at goal this week, so resume sacubitril/valsartan 24/26 mg twice daily and furosemide 40 mg daily at the prior home doses today; continue carvedilol 12.5 mg twice daily. Recheck renal function on today's labs.</w:t>
+        <w:t>1. Cardiorenal (HFrEF, CAD, CKD3, resolved AKI). On the basis of his reported home blood pressures, resume sacubitril/valsartan 24/26 mg twice daily and furosemide 40 mg daily at the prior home doses today; continue carvedilol 12.5 mg twice daily. Recheck renal function on today's labs.</w:t>
       </w:r>
     </w:p>
     <w:p>

</xml_diff>